<commit_message>
fix(survey): corrigir condicionais e confirmar envio
Revisa integralmente as dependências do questionário para impedir a exibição prematura de justificativas negativas e manter os uploads vinculados às práticas efetivamente declaradas.

Alinha as evidências de inventário e computação em nuvem, condiciona a mensuração de uso de nuvem, substitui referências a comentários inexistentes e acrescenta campos de detalhamento para não aplicabilidade, opção aberta e classificação de sigilo.

Adiciona a questão obrigatória Q134 para ciência da revisão e do envio das respostas e regenera os produtos LSS, DOCX e PDF a partir do Markdown canônico.
</commit_message>
<xml_diff>
--- a/02-Execução/01-Questionário/questionario_lgpd_2026.docx
+++ b/02-Execução/01-Questionário/questionario_lgpd_2026.docx
@@ -109,7 +109,7 @@
         <w:jc w:val="both"/>
       </w:pPr>
       <w:r>
-        <w:t>Nos campos de comentário, informe datas, unidades responsáveis e referências de atos, processos ou documentos que permitam compreender a resposta. Nos anexos, envie somente o conteúdo necessário e oculte dados pessoais, informações sigilosas, credenciais e detalhes técnicos sem pertinência para a fiscalização.</w:t>
+        <w:t>Nas respostas abertas, informe datas, unidades responsáveis e referências de atos, processos ou documentos que permitam compreender a resposta. Nos anexos, envie somente o conteúdo necessário e oculte dados pessoais, informações sigilosas, credenciais e detalhes técnicos sem pertinência para a fiscalização.</w:t>
       </w:r>
     </w:p>
     <w:p>
@@ -1039,7 +1039,7 @@
         <w:t xml:space="preserve">?  </w:t>
       </w:r>
       <w:r>
-        <w:t>Responda “Sim” somente se o colegiado tiver sido instituído, for multissetorial, contar com a participação do Encarregado e abranger as quatro finalidades indicadas. No comentário, informe o ato ou processo de instituição e as unidades representadas, quando existente.</w:t>
+        <w:t>Responda “Sim” somente se o colegiado tiver sido instituído, for multissetorial, contar com a participação do Encarregado e abranger as quatro finalidades indicadas.</w:t>
       </w:r>
     </w:p>
     <w:p>
@@ -1268,7 +1268,7 @@
         <w:t xml:space="preserve">?  </w:t>
       </w:r>
       <w:r>
-        <w:t>Considere os encaminhamentos aplicáveis à organização. No comentário, indique o plano, processo, ato ou outra iniciativa em que foram considerados.</w:t>
+        <w:t>Considere todos os encaminhamentos do Acórdão aplicáveis à organização e responda de acordo com a iniciativa de adequação efetivamente conduzida.</w:t>
       </w:r>
     </w:p>
     <w:p>
@@ -1361,7 +1361,7 @@
         <w:t xml:space="preserve">?  </w:t>
       </w:r>
       <w:r>
-        <w:t>Considere o prazo de 60 dias contado da ciência da decisão. No comentário, informe a data de conclusão do plano e o número do processo administrativo, quando existentes.</w:t>
+        <w:t>Considere o prazo de 60 dias contado da ciência da decisão e a existência de registro formal em processo administrativo.</w:t>
       </w:r>
     </w:p>
     <w:p>
@@ -3103,7 +3103,7 @@
         <w:t xml:space="preserve">?  </w:t>
       </w:r>
       <w:r>
-        <w:t>No comentário, informe a data, o veículo ou canal oficial e a referência da publicação.</w:t>
+        <w:t>Considere como publicada a política divulgada em veículo ou canal oficial, com data e referência verificáveis.</w:t>
       </w:r>
     </w:p>
     <w:p>
@@ -3181,7 +3181,7 @@
         <w:t xml:space="preserve">?  </w:t>
       </w:r>
       <w:r>
-        <w:t>No comentário, informe a data, o veículo ou canal oficial e a referência da publicação.</w:t>
+        <w:t>Considere como publicada a política divulgada em veículo ou canal oficial, com data e referência verificáveis.</w:t>
       </w:r>
     </w:p>
     <w:p>
@@ -4103,7 +4103,7 @@
         <w:t xml:space="preserve">○  </w:t>
       </w:r>
       <w:r>
-        <w:t>Não se aplica — justifique no campo de comentário</w:t>
+        <w:t>Não se aplica</w:t>
       </w:r>
     </w:p>
     <w:p>
@@ -4182,7 +4182,7 @@
         <w:t xml:space="preserve">?  </w:t>
       </w:r>
       <w:r>
-        <w:t>Use o comentário para identificar o plano, as ações, datas, públicos alcançados e unidades responsáveis.</w:t>
+        <w:t>Considere o plano vigente e as ações efetivamente realizadas, inclusive datas e públicos alcançados.</w:t>
       </w:r>
     </w:p>
     <w:p>
@@ -4542,7 +4542,7 @@
         <w:keepNext/>
       </w:pPr>
       <w:r>
-        <w:t>Esta pergunta será exibida quando a resposta à pergunta Q51 for “Não se aplica — justifique no campo de comentário”, “Não possui plano de capacitação e os colaboradores ainda não realizaram treinamento em proteção de dados pessoais”, “Não possui plano de capacitação, mas colaboradores específicos já realizaram treinamento em proteção de dados pessoais” ou “Possui plano de capacitação sem conteúdo específico de proteção de dados, mas já realizou treinamento abrangente nessa área”.</w:t>
+        <w:t>Esta pergunta será exibida quando a resposta à pergunta Q51 for “Não se aplica”, “Não possui plano de capacitação e os colaboradores ainda não realizaram treinamento em proteção de dados pessoais”, “Não possui plano de capacitação, mas colaboradores específicos já realizaram treinamento em proteção de dados pessoais” ou “Possui plano de capacitação sem conteúdo específico de proteção de dados, mas já realizou treinamento abrangente nessa área”.</w:t>
       </w:r>
     </w:p>
     <w:p>
@@ -4557,7 +4557,7 @@
           <w:color w:val="5B9BD5"/>
           <w:sz w:val="18"/>
         </w:rPr>
-        <w:t>Descreva as causas e os fatos concretos que mantêm a pendência. Se não houver justificativa institucional registrada, declare isso expressamente. Não informe nomes de servidores nem dados pessoais desnecessários.</w:t>
+        <w:t>Se a resposta à questão 5.1 foi “Não se aplica”, justifique objetivamente a não aplicabilidade. Nos demais casos, descreva as causas e os fatos concretos que mantêm a pendência. Se não houver justificativa institucional registrada, declare isso expressamente. Não informe nomes de servidores nem dados pessoais desnecessários.</w:t>
       </w:r>
     </w:p>
     <w:p>
@@ -5088,7 +5088,7 @@
         <w:keepNext/>
       </w:pPr>
       <w:r>
-        <w:t>Esta pergunta será exibida quando o item “Possui Inventário de Dados Pessoais ou registro equivalente para consolidar as características das atividades de tratamento” for marcado na pergunta Q61 ou o item “Catalogou no inventário informações que abrangem todas as principais atividades de tratamento” for marcado na pergunta Q61.</w:t>
+        <w:t>Esta pergunta será exibida quando o item “Possui Inventário de Dados Pessoais ou registro equivalente para consolidar as características das atividades de tratamento” for marcado na pergunta Q61.</w:t>
       </w:r>
     </w:p>
     <w:tbl>
@@ -5838,7 +5838,7 @@
         <w:t xml:space="preserve">○  </w:t>
       </w:r>
       <w:r>
-        <w:t>Não se aplica — justifique no campo de comentário</w:t>
+        <w:t>Não se aplica</w:t>
       </w:r>
     </w:p>
     <w:p>
@@ -5893,7 +5893,7 @@
         <w:t xml:space="preserve">?  </w:t>
       </w:r>
       <w:r>
-        <w:t>Se houver publicação, informe no comentário a URL exata. Se não se aplicar, apresente a justificativa.</w:t>
+        <w:t>Considere como publicada a declaração disponível no portal institucional em endereço verificável. Se a opção “Não se aplica” for selecionada, apresente a justificativa na pergunta de monitoramento exibida em seguida.</w:t>
       </w:r>
     </w:p>
     <w:p>
@@ -6075,7 +6075,7 @@
         <w:t xml:space="preserve">○  </w:t>
       </w:r>
       <w:r>
-        <w:t>Não se aplica — justifique no campo de comentário</w:t>
+        <w:t>Não se aplica</w:t>
       </w:r>
     </w:p>
     <w:p>
@@ -6130,7 +6130,7 @@
         <w:t xml:space="preserve">?  </w:t>
       </w:r>
       <w:r>
-        <w:t>No comentário, informe os canais, os direitos atendidos, a forma de autenticação e o fluxo de encaminhamento das solicitações.</w:t>
+        <w:t>Considere os canais efetivamente disponíveis, os direitos atendidos, a forma de autenticação e o fluxo de encaminhamento das solicitações. Se a opção “Não se aplica” for selecionada, apresente a justificativa na pergunta de monitoramento exibida em seguida.</w:t>
       </w:r>
     </w:p>
     <w:p>
@@ -6383,7 +6383,7 @@
         <w:keepNext/>
       </w:pPr>
       <w:r>
-        <w:t>Esta pergunta será exibida quando a resposta à pergunta Q71 for “Não se aplica — justifique no campo de comentário”, “Não elaborou Política de Privacidade ou instrumento equivalente” ou “Elaborou a política, mas não a divulga no portal institucional”.</w:t>
+        <w:t>Esta pergunta será exibida quando a resposta à pergunta Q71 for “Não se aplica”, “Não elaborou Política de Privacidade ou instrumento equivalente” ou “Elaborou a política, mas não a divulga no portal institucional”.</w:t>
       </w:r>
     </w:p>
     <w:p>
@@ -6398,7 +6398,7 @@
           <w:color w:val="5B9BD5"/>
           <w:sz w:val="18"/>
         </w:rPr>
-        <w:t>Descreva as causas e os fatos concretos que mantêm a pendência. Se não houver justificativa institucional registrada, declare isso expressamente. Não informe nomes de servidores nem dados pessoais desnecessários.</w:t>
+        <w:t>Se a resposta à questão 7.1 foi “Não se aplica”, justifique objetivamente a não aplicabilidade. Nos demais casos, descreva as causas e os fatos concretos que mantêm a pendência. Se não houver justificativa institucional registrada, declare isso expressamente. Não informe nomes de servidores nem dados pessoais desnecessários.</w:t>
       </w:r>
     </w:p>
     <w:p>
@@ -6531,7 +6531,7 @@
         <w:keepNext/>
       </w:pPr>
       <w:r>
-        <w:t>Esta pergunta será exibida quando a resposta à pergunta Q72 for “Não se aplica — justifique no campo de comentário”, “Não foram implementados mecanismos para atender aos direitos dos titulares” ou “Foram implementados mecanismos para atender a alguns direitos, mas não a todos”.</w:t>
+        <w:t>Esta pergunta será exibida quando a resposta à pergunta Q72 for “Não se aplica”, “Não foram implementados mecanismos para atender aos direitos dos titulares” ou “Foram implementados mecanismos para atender a alguns direitos, mas não a todos”.</w:t>
       </w:r>
     </w:p>
     <w:p>
@@ -6546,7 +6546,7 @@
           <w:color w:val="5B9BD5"/>
           <w:sz w:val="18"/>
         </w:rPr>
-        <w:t>Descreva as causas e os fatos concretos que mantêm a pendência. Se não houver justificativa institucional registrada, declare isso expressamente. Não informe nomes de servidores nem dados pessoais desnecessários.</w:t>
+        <w:t>Se a resposta à questão 7.2 foi “Não se aplica”, justifique objetivamente a não aplicabilidade. Nos demais casos, descreva as causas e os fatos concretos que mantêm a pendência. Se não houver justificativa institucional registrada, declare isso expressamente. Não informe nomes de servidores nem dados pessoais desnecessários.</w:t>
       </w:r>
     </w:p>
     <w:p>
@@ -6809,7 +6809,7 @@
         <w:t xml:space="preserve">○  </w:t>
       </w:r>
       <w:r>
-        <w:t>Não se aplica — justifique no campo de comentário</w:t>
+        <w:t>Não se aplica — justifique na pergunta seguinte</w:t>
       </w:r>
     </w:p>
     <w:p>
@@ -6888,8 +6888,82 @@
         <w:t xml:space="preserve">?  </w:t>
       </w:r>
       <w:r>
-        <w:t>Use o comentário para identificar os principais fluxos, destinatários, finalidades e registros existentes.</w:t>
-      </w:r>
+        <w:t>Considere os principais fluxos, destinatários, finalidades e registros existentes. Se escolher “Não se aplica”, justifique a não aplicabilidade na pergunta exibida em seguida.</w:t>
+      </w:r>
+    </w:p>
+    <w:p>
+      <w:pPr>
+        <w:spacing w:before="80" w:after="140"/>
+        <w:pBdr>
+          <w:bottom w:val="single" w:sz="3" w:space="5" w:color="D7E2F0"/>
+        </w:pBdr>
+      </w:pPr>
+    </w:p>
+    <w:p>
+      <w:pPr>
+        <w:pStyle w:val="Ttulo2"/>
+        <w:keepNext/>
+      </w:pPr>
+      <w:r>
+        <w:t>8.1.A. Justifique a seleção da alternativa “Não se aplica” na questão 8.1, descrevendo por que o compartilhamento de dados pessoais com terceiros não se aplica à organização.</w:t>
+      </w:r>
+    </w:p>
+    <w:p>
+      <w:pPr>
+        <w:pStyle w:val="SurveyMetadata"/>
+        <w:keepNext/>
+      </w:pPr>
+      <w:r>
+        <w:t>resposta obrigatória</w:t>
+      </w:r>
+    </w:p>
+    <w:p>
+      <w:pPr>
+        <w:pStyle w:val="SurveyCondition"/>
+        <w:keepNext/>
+      </w:pPr>
+      <w:r>
+        <w:t>Esta pergunta será exibida quando a resposta à pergunta Q81 for “Não se aplica — justifique na pergunta seguinte”.</w:t>
+      </w:r>
+    </w:p>
+    <w:p>
+      <w:pPr>
+        <w:pStyle w:val="SurveyExplain"/>
+        <w:keepNext/>
+        <w:ind w:left="2160" w:right="113"/>
+      </w:pPr>
+      <w:r>
+        <w:rPr>
+          <w:rFonts w:ascii="Calibri" w:hAnsi="Calibri" w:eastAsia="Calibri"/>
+          <w:color w:val="5B9BD5"/>
+          <w:sz w:val="18"/>
+        </w:rPr>
+        <w:t>Apresente fundamentos objetivos relacionados aos tratamentos realizados pela prefeitura. Não informe dados pessoais nem informações sigilosas desnecessárias.</w:t>
+      </w:r>
+    </w:p>
+    <w:p>
+      <w:pPr>
+        <w:spacing w:before="40" w:after="40"/>
+        <w:pBdr>
+          <w:bottom w:val="single" w:sz="3" w:space="5" w:color="B8B8B8"/>
+        </w:pBdr>
+      </w:pPr>
+    </w:p>
+    <w:p>
+      <w:pPr>
+        <w:spacing w:before="40" w:after="40"/>
+        <w:pBdr>
+          <w:bottom w:val="single" w:sz="3" w:space="5" w:color="B8B8B8"/>
+        </w:pBdr>
+      </w:pPr>
+    </w:p>
+    <w:p>
+      <w:pPr>
+        <w:spacing w:before="40" w:after="40"/>
+        <w:pBdr>
+          <w:bottom w:val="single" w:sz="3" w:space="5" w:color="B8B8B8"/>
+        </w:pBdr>
+      </w:pPr>
     </w:p>
     <w:p>
       <w:pPr>
@@ -6978,7 +7052,7 @@
         <w:t xml:space="preserve">?  </w:t>
       </w:r>
       <w:r>
-        <w:t>Use o comentário para identificar serviços, operadores e países ou regiões envolvidos, sem registrar dados pessoais.</w:t>
+        <w:t>Considere todos os serviços, operadores e países ou regiões envolvidos, sem registrar dados pessoais na resposta.</w:t>
       </w:r>
     </w:p>
     <w:p>
@@ -7068,7 +7142,7 @@
         <w:t xml:space="preserve">?  </w:t>
       </w:r>
       <w:r>
-        <w:t>No comentário, identifique a hipótese ou salvaguarda considerada e o processo administrativo correspondente.</w:t>
+        <w:t>Considere a hipótese ou salvaguarda aplicável e a existência de registro no processo administrativo correspondente.</w:t>
       </w:r>
     </w:p>
     <w:p>
@@ -7099,6 +7173,21 @@
     </w:p>
     <w:p>
       <w:pPr>
+        <w:pStyle w:val="SurveyExplain"/>
+        <w:keepNext/>
+        <w:ind w:left="2160" w:right="113"/>
+      </w:pPr>
+      <w:r>
+        <w:rPr>
+          <w:rFonts w:ascii="Calibri" w:hAnsi="Calibri" w:eastAsia="Calibri"/>
+          <w:color w:val="5B9BD5"/>
+          <w:sz w:val="18"/>
+        </w:rPr>
+        <w:t>Marque as alternativas sobre território de armazenamento, avaliação de riscos e cláusulas contratuais somente se também marcar que a organização realiza tratamento de dados pessoais em nuvem. Se não houver esse tratamento, marque exclusivamente a última alternativa.</w:t>
+      </w:r>
+    </w:p>
+    <w:p>
+      <w:pPr>
         <w:pStyle w:val="SurveyOption"/>
         <w:ind w:left="369" w:hanging="238"/>
       </w:pPr>
@@ -7189,7 +7278,7 @@
         <w:keepNext/>
       </w:pPr>
       <w:r>
-        <w:t>Esta pergunta será exibida quando o item “Realiza tratamento de dados pessoais em nuvem, ainda que somente armazenamento” for marcado na pergunta Q812.</w:t>
+        <w:t>Esta pergunta será exibida quando o item “Incluiu nos contratos com provedores cláusulas sobre sigilo, segurança, transferência a terceiros, eliminação ao término e limitação de uso dos dados” for marcado na pergunta Q812.</w:t>
       </w:r>
     </w:p>
     <w:tbl>
@@ -7329,6 +7418,15 @@
     </w:p>
     <w:p>
       <w:pPr>
+        <w:pStyle w:val="SurveyCondition"/>
+        <w:keepNext/>
+      </w:pPr>
+      <w:r>
+        <w:t>Esta pergunta será exibida quando o item “Realiza tratamento de dados pessoais em nuvem, ainda que somente armazenamento” for marcado na pergunta Q812 ou o item “Avaliou e pode assegurar que não há armazenamento de dados pessoais em território estrangeiro” for marcado na pergunta Q812 ou o item “Realizou avaliação de riscos desse tratamento, apoiada em análise e relatório de impacto submetidos às instâncias competentes” for marcado na pergunta Q812 ou o item “Incluiu nos contratos com provedores cláusulas sobre sigilo, segurança, transferência a terceiros, eliminação ao término e limitação de uso dos dados” for marcado na pergunta Q812 ou o item “Não realiza tratamento de dados pessoais em nuvem” for marcado na pergunta Q812.</w:t>
+      </w:r>
+    </w:p>
+    <w:p>
+      <w:pPr>
         <w:pStyle w:val="SurveyOption"/>
         <w:ind w:left="369" w:hanging="238"/>
       </w:pPr>
@@ -7427,7 +7525,7 @@
         <w:t xml:space="preserve">?  </w:t>
       </w:r>
       <w:r>
-        <w:t>Use como denominador o total de soluções tecnológicas conhecidas que tratam dados pessoais e, como numerador, aquelas que utilizam computação em nuvem. Considere sistemas, aplicações, armazenamento, cópias de segurança, correio eletrônico e ferramentas de colaboração. No comentário, indique a base da estimativa e os principais tipos de serviço considerados.</w:t>
+        <w:t>Use como denominador o total de soluções tecnológicas conhecidas que tratam dados pessoais e, como numerador, aquelas que utilizam computação em nuvem. Considere sistemas, aplicações, armazenamento, cópias de segurança, correio eletrônico e ferramentas de colaboração. Se a organização informou que não realiza tratamento em nuvem, selecione “Nenhuma solução — 0%”.</w:t>
       </w:r>
     </w:p>
     <w:p>
@@ -9131,7 +9229,7 @@
         <w:t xml:space="preserve">?  </w:t>
       </w:r>
       <w:r>
-        <w:t>Use o comentário para indicar como o material foi divulgado e utilizado pelas unidades municipais.</w:t>
+        <w:t>Considere o conhecimento institucional prévio e o uso efetivo do material pelas unidades municipais.</w:t>
       </w:r>
     </w:p>
     <w:p>
@@ -9579,6 +9677,80 @@
       <w:r>
         <w:t>Outro material ou ação</w:t>
       </w:r>
+    </w:p>
+    <w:p>
+      <w:pPr>
+        <w:spacing w:before="80" w:after="140"/>
+        <w:pBdr>
+          <w:bottom w:val="single" w:sz="3" w:space="5" w:color="D7E2F0"/>
+        </w:pBdr>
+      </w:pPr>
+    </w:p>
+    <w:p>
+      <w:pPr>
+        <w:pStyle w:val="Ttulo2"/>
+        <w:keepNext/>
+      </w:pPr>
+      <w:r>
+        <w:t>12.4.A. Descreva o outro material ou ação que poderia apoiar melhor a adequação municipal à LGPD.</w:t>
+      </w:r>
+    </w:p>
+    <w:p>
+      <w:pPr>
+        <w:pStyle w:val="SurveyMetadata"/>
+        <w:keepNext/>
+      </w:pPr>
+      <w:r>
+        <w:t>resposta obrigatória</w:t>
+      </w:r>
+    </w:p>
+    <w:p>
+      <w:pPr>
+        <w:pStyle w:val="SurveyCondition"/>
+        <w:keepNext/>
+      </w:pPr>
+      <w:r>
+        <w:t>Esta pergunta será exibida quando o item “Outro material ou ação” for marcado na pergunta Q124.</w:t>
+      </w:r>
+    </w:p>
+    <w:p>
+      <w:pPr>
+        <w:pStyle w:val="SurveyExplain"/>
+        <w:keepNext/>
+        <w:ind w:left="2160" w:right="113"/>
+      </w:pPr>
+      <w:r>
+        <w:rPr>
+          <w:rFonts w:ascii="Calibri" w:hAnsi="Calibri" w:eastAsia="Calibri"/>
+          <w:color w:val="5B9BD5"/>
+          <w:sz w:val="18"/>
+        </w:rPr>
+        <w:t>Seja objetivo e não inclua dados pessoais ou informações sigilosas desnecessárias.</w:t>
+      </w:r>
+    </w:p>
+    <w:p>
+      <w:pPr>
+        <w:spacing w:before="40" w:after="40"/>
+        <w:pBdr>
+          <w:bottom w:val="single" w:sz="3" w:space="5" w:color="B8B8B8"/>
+        </w:pBdr>
+      </w:pPr>
+    </w:p>
+    <w:p>
+      <w:pPr>
+        <w:spacing w:before="40" w:after="40"/>
+        <w:pBdr>
+          <w:bottom w:val="single" w:sz="3" w:space="5" w:color="B8B8B8"/>
+        </w:pBdr>
+      </w:pPr>
+    </w:p>
+    <w:p>
+      <w:pPr>
+        <w:spacing w:before="40" w:after="40"/>
+        <w:pBdr>
+          <w:bottom w:val="single" w:sz="3" w:space="5" w:color="B8B8B8"/>
+        </w:pBdr>
+      </w:pPr>
     </w:p>
     <w:p>
       <w:pPr>
@@ -9940,7 +10112,134 @@
         <w:t xml:space="preserve">?  </w:t>
       </w:r>
       <w:r>
-        <w:t>Em caso positivo, identifique no comentário os itens e apresente a justificativa e a referência do instrumento de classificação, sem repetir o conteúdo protegido.</w:t>
+        <w:t>Em caso positivo, identifique os itens e apresente a fundamentação na pergunta exibida em seguida, sem repetir o conteúdo protegido.</w:t>
+      </w:r>
+    </w:p>
+    <w:p>
+      <w:pPr>
+        <w:spacing w:before="80" w:after="140"/>
+        <w:pBdr>
+          <w:bottom w:val="single" w:sz="3" w:space="5" w:color="D7E2F0"/>
+        </w:pBdr>
+      </w:pPr>
+    </w:p>
+    <w:p>
+      <w:pPr>
+        <w:pStyle w:val="Ttulo2"/>
+        <w:keepNext/>
+      </w:pPr>
+      <w:r>
+        <w:t>13.3.A. Identifique as respostas ou os anexos considerados não públicos e informe a justificativa e a referência do instrumento de classificação aplicável.</w:t>
+      </w:r>
+    </w:p>
+    <w:p>
+      <w:pPr>
+        <w:pStyle w:val="SurveyMetadata"/>
+        <w:keepNext/>
+      </w:pPr>
+      <w:r>
+        <w:t>resposta obrigatória</w:t>
+      </w:r>
+    </w:p>
+    <w:p>
+      <w:pPr>
+        <w:pStyle w:val="SurveyCondition"/>
+        <w:keepNext/>
+      </w:pPr>
+      <w:r>
+        <w:t>Esta pergunta será exibida quando a resposta à pergunta Q133 for “Sim”.</w:t>
+      </w:r>
+    </w:p>
+    <w:p>
+      <w:pPr>
+        <w:pStyle w:val="SurveyExplain"/>
+        <w:keepNext/>
+        <w:ind w:left="2160" w:right="113"/>
+      </w:pPr>
+      <w:r>
+        <w:rPr>
+          <w:rFonts w:ascii="Calibri" w:hAnsi="Calibri" w:eastAsia="Calibri"/>
+          <w:color w:val="5B9BD5"/>
+          <w:sz w:val="18"/>
+        </w:rPr>
+        <w:t>Não repita o conteúdo protegido nem inclua dados pessoais ou informações sigilosas desnecessárias.</w:t>
+      </w:r>
+    </w:p>
+    <w:p>
+      <w:pPr>
+        <w:spacing w:before="40" w:after="40"/>
+        <w:pBdr>
+          <w:bottom w:val="single" w:sz="3" w:space="5" w:color="B8B8B8"/>
+        </w:pBdr>
+      </w:pPr>
+    </w:p>
+    <w:p>
+      <w:pPr>
+        <w:spacing w:before="40" w:after="40"/>
+        <w:pBdr>
+          <w:bottom w:val="single" w:sz="3" w:space="5" w:color="B8B8B8"/>
+        </w:pBdr>
+      </w:pPr>
+    </w:p>
+    <w:p>
+      <w:pPr>
+        <w:spacing w:before="40" w:after="40"/>
+        <w:pBdr>
+          <w:bottom w:val="single" w:sz="3" w:space="5" w:color="B8B8B8"/>
+        </w:pBdr>
+      </w:pPr>
+    </w:p>
+    <w:p>
+      <w:pPr>
+        <w:spacing w:before="80" w:after="140"/>
+        <w:pBdr>
+          <w:bottom w:val="single" w:sz="3" w:space="5" w:color="D7E2F0"/>
+        </w:pBdr>
+      </w:pPr>
+    </w:p>
+    <w:p>
+      <w:pPr>
+        <w:pStyle w:val="Ttulo2"/>
+        <w:keepNext/>
+      </w:pPr>
+      <w:r>
+        <w:t>13.4. Finalizar o questionário</w:t>
+      </w:r>
+    </w:p>
+    <w:p>
+      <w:pPr>
+        <w:pStyle w:val="SurveyMetadata"/>
+        <w:keepNext/>
+      </w:pPr>
+      <w:r>
+        <w:t>resposta obrigatória</w:t>
+      </w:r>
+    </w:p>
+    <w:p>
+      <w:pPr>
+        <w:pStyle w:val="SurveyExplain"/>
+        <w:keepNext/>
+        <w:ind w:left="2160" w:right="113"/>
+      </w:pPr>
+      <w:r>
+        <w:rPr>
+          <w:rFonts w:ascii="Calibri" w:hAnsi="Calibri" w:eastAsia="Calibri"/>
+          <w:color w:val="5B9BD5"/>
+          <w:sz w:val="18"/>
+        </w:rPr>
+        <w:t>Antes de confirmar, revise as respostas e os anexos. A conclusão do envio ocorrerá quando o botão de envio do questionário for acionado.</w:t>
+      </w:r>
+    </w:p>
+    <w:p>
+      <w:pPr>
+        <w:pStyle w:val="SurveyOption"/>
+        <w:ind w:left="369" w:hanging="238"/>
+      </w:pPr>
+      <w:r>
+        <w:t xml:space="preserve">○  </w:t>
+      </w:r>
+      <w:r>
+        <w:t>Declaro que revisei as respostas e estou ciente de que, ao finalizar o questionário, elas serão enviadas ao TCE-RJ</w:t>
       </w:r>
     </w:p>
     <w:p>

</xml_diff>